<commit_message>
"Tasdiqlash" xatiga "Qayta o'rganildimi?" (Ha/Yoq) tanlovini qo'shish
Arizalar tez-tez qayta ko'rib chiqiladi va natijada rad ham, tasdiq ham
bo'lishi mumkin - "qayta o'rganilganda"/"o'rganilganda" farqi endi faqat
"Rad etish"da emas, "Tasdiqlash"da ham ko'rsatiladi. Ha/Yoq tanlovi
ikkala shablon uchun umumiy blokka ko'chirildi (shablon tanlanganda
ko'rsatiladi/berkitiladi).

Kengaytma buni Application/GetStatusHistory'dagi status yozuvlaridan
avtomatik aniqlaydi: agar biror yozuvning "note" matnida "Qayta
tekshiruv" so'zi bo'lsa, "Ha" deb belgilanadi (real namunada ko'rilgan:
"Qayta tekshiruv (jamoa qarori 2026-09-12): ...").

Co-Authored-By: Claude Sonnet 5 <noreply@anthropic.com>
</commit_message>
<xml_diff>
--- a/Shablons/reeystr/tasdiqlandi.docx
+++ b/Shablons/reeystr/tasdiqlandi.docx
@@ -333,7 +333,25 @@
           <w:i w:val="0"/>
           <w:sz w:val="28"/>
         </w:rPr>
-        <w:t xml:space="preserve"> raqam bilan kiritilgan va </w:t>
+        <w:t xml:space="preserve"> raqam bilan kiritilgan va dastur tomonidan </w:t>
+      </w:r>
+      <w:r>
+        <w:rPr>
+          <w:rFonts w:ascii="Times New Roman" w:hAnsi="Times New Roman"/>
+          <w:b w:val="0"/>
+          <w:i w:val="0"/>
+          <w:sz w:val="28"/>
+        </w:rPr>
+        <w:t>{qayta}</w:t>
+      </w:r>
+      <w:r>
+        <w:rPr>
+          <w:rFonts w:ascii="Times New Roman" w:hAnsi="Times New Roman"/>
+          <w:b w:val="0"/>
+          <w:i w:val="0"/>
+          <w:sz w:val="28"/>
+        </w:rPr>
+        <w:t xml:space="preserve">o'rganilganda </w:t>
       </w:r>
       <w:r>
         <w:rPr>

</xml_diff>